<commit_message>
Sort rows sector-alpha, then most recent date first within sector
Builder now parses DD-Mmm-YY dates and sorts descending within each
sector (previously an ascending string sort on the raw date). SKILL.md
rule text and the rebuild guide's prose + verbatim appendices updated
to match.

Co-Authored-By: Claude Fable 5 <noreply@anthropic.com>
Claude-Session: https://claude.ai/code/session_01C4GUTYZ6qzZHSC1259v3XU
</commit_message>
<xml_diff>
--- a/weekly-deals/Weekly_Deals_Agent_Rebuild_Guide.docx
+++ b/weekly-deals/Weekly_Deals_Agent_Rebuild_Guide.docx
@@ -1627,7 +1627,7 @@
           <w:sz w:val="21"/>
           <w:szCs w:val="21"/>
         </w:rPr>
-        <w:t xml:space="preserve">Dates DD-Mmm-YY. The link cell shows the word "Link", hyperlinked to the source. Rows are ordered sector-alphabetical, then date.</w:t>
+        <w:t xml:space="preserve">Dates DD-Mmm-YY. The link cell shows the word "Link", hyperlinked to the source. Rows are ordered sector-alphabetical, then most recent date first within each sector.</w:t>
       </w:r>
     </w:p>
     <w:p>
@@ -2000,7 +2000,7 @@
           <w:sz w:val="21"/>
           <w:szCs w:val="21"/>
         </w:rPr>
-        <w:t xml:space="preserve">Sorting: rows sorted by (sector, date) within each tab before writing.</w:t>
+        <w:t xml:space="preserve">Sorting: within each tab, rows sorted sector-alphabetical, then descending by parsed date (most recent first) within the sector; unparseable dates sink to the bottom of their sector.</w:t>
       </w:r>
     </w:p>
     <w:p>
@@ -4257,7 +4257,22 @@
           <w:sz w:val="17"/>
           <w:szCs w:val="17"/>
         </w:rPr>
-        <w:t xml:space="preserve">- Dates DD-Mmm-YY. Link cell shows "Link" hyperlinked. Rows ordered sector-alpha, then date.</w:t>
+        <w:t xml:space="preserve">- Dates DD-Mmm-YY. Link cell shows "Link" hyperlinked. Rows ordered sector-alpha, then most</w:t>
+      </w:r>
+    </w:p>
+    <w:p>
+      <w:pPr>
+        <w:shd w:fill="F4F6F8" w:val="clear"/>
+        <w:spacing w:after="0"/>
+        <w:ind w:left="240" w:right="240"/>
+      </w:pPr>
+      <w:r>
+        <w:rPr>
+          <w:rFonts w:ascii="Consolas" w:cs="Consolas" w:eastAsia="Consolas" w:hAnsi="Consolas"/>
+          <w:sz w:val="17"/>
+          <w:szCs w:val="17"/>
+        </w:rPr>
+        <w:t xml:space="preserve">  recent date first within each sector.</w:t>
       </w:r>
     </w:p>
     <w:p>
@@ -7023,6 +7038,141 @@
           <w:sz w:val="17"/>
           <w:szCs w:val="17"/>
         </w:rPr>
+        <w:t xml:space="preserve">def sort_key(row):</w:t>
+      </w:r>
+    </w:p>
+    <w:p>
+      <w:pPr>
+        <w:shd w:fill="F4F6F8" w:val="clear"/>
+        <w:spacing w:after="0"/>
+        <w:ind w:left="240" w:right="240"/>
+      </w:pPr>
+      <w:r>
+        <w:rPr>
+          <w:rFonts w:ascii="Consolas" w:cs="Consolas" w:eastAsia="Consolas" w:hAnsi="Consolas"/>
+          <w:sz w:val="17"/>
+          <w:szCs w:val="17"/>
+        </w:rPr>
+        <w:t xml:space="preserve">    """Sector alphabetical, then most recent date first within the sector."""</w:t>
+      </w:r>
+    </w:p>
+    <w:p>
+      <w:pPr>
+        <w:shd w:fill="F4F6F8" w:val="clear"/>
+        <w:spacing w:after="0"/>
+        <w:ind w:left="240" w:right="240"/>
+      </w:pPr>
+      <w:r>
+        <w:rPr>
+          <w:rFonts w:ascii="Consolas" w:cs="Consolas" w:eastAsia="Consolas" w:hAnsi="Consolas"/>
+          <w:sz w:val="17"/>
+          <w:szCs w:val="17"/>
+        </w:rPr>
+        <w:t xml:space="preserve">    try:</w:t>
+      </w:r>
+    </w:p>
+    <w:p>
+      <w:pPr>
+        <w:shd w:fill="F4F6F8" w:val="clear"/>
+        <w:spacing w:after="0"/>
+        <w:ind w:left="240" w:right="240"/>
+      </w:pPr>
+      <w:r>
+        <w:rPr>
+          <w:rFonts w:ascii="Consolas" w:cs="Consolas" w:eastAsia="Consolas" w:hAnsi="Consolas"/>
+          <w:sz w:val="17"/>
+          <w:szCs w:val="17"/>
+        </w:rPr>
+        <w:t xml:space="preserve">        d = datetime.datetime.strptime(str(row.get("date", "")).strip(), "%d-%b-%y").date()</w:t>
+      </w:r>
+    </w:p>
+    <w:p>
+      <w:pPr>
+        <w:shd w:fill="F4F6F8" w:val="clear"/>
+        <w:spacing w:after="0"/>
+        <w:ind w:left="240" w:right="240"/>
+      </w:pPr>
+      <w:r>
+        <w:rPr>
+          <w:rFonts w:ascii="Consolas" w:cs="Consolas" w:eastAsia="Consolas" w:hAnsi="Consolas"/>
+          <w:sz w:val="17"/>
+          <w:szCs w:val="17"/>
+        </w:rPr>
+        <w:t xml:space="preserve">    except ValueError:</w:t>
+      </w:r>
+    </w:p>
+    <w:p>
+      <w:pPr>
+        <w:shd w:fill="F4F6F8" w:val="clear"/>
+        <w:spacing w:after="0"/>
+        <w:ind w:left="240" w:right="240"/>
+      </w:pPr>
+      <w:r>
+        <w:rPr>
+          <w:rFonts w:ascii="Consolas" w:cs="Consolas" w:eastAsia="Consolas" w:hAnsi="Consolas"/>
+          <w:sz w:val="17"/>
+          <w:szCs w:val="17"/>
+        </w:rPr>
+        <w:t xml:space="preserve">        d = datetime.date.min</w:t>
+      </w:r>
+    </w:p>
+    <w:p>
+      <w:pPr>
+        <w:shd w:fill="F4F6F8" w:val="clear"/>
+        <w:spacing w:after="0"/>
+        <w:ind w:left="240" w:right="240"/>
+      </w:pPr>
+      <w:r>
+        <w:rPr>
+          <w:rFonts w:ascii="Consolas" w:cs="Consolas" w:eastAsia="Consolas" w:hAnsi="Consolas"/>
+          <w:sz w:val="17"/>
+          <w:szCs w:val="17"/>
+        </w:rPr>
+        <w:t xml:space="preserve">    return (row.get("sector", ""), -d.toordinal())</w:t>
+      </w:r>
+    </w:p>
+    <w:p>
+      <w:pPr>
+        <w:shd w:fill="F4F6F8" w:val="clear"/>
+        <w:spacing w:after="0"/>
+        <w:ind w:left="240" w:right="240"/>
+      </w:pPr>
+      <w:r>
+        <w:rPr>
+          <w:rFonts w:ascii="Consolas" w:cs="Consolas" w:eastAsia="Consolas" w:hAnsi="Consolas"/>
+          <w:sz w:val="17"/>
+          <w:szCs w:val="17"/>
+        </w:rPr>
+        <w:t xml:space="preserve"> </w:t>
+      </w:r>
+    </w:p>
+    <w:p>
+      <w:pPr>
+        <w:shd w:fill="F4F6F8" w:val="clear"/>
+        <w:spacing w:after="0"/>
+        <w:ind w:left="240" w:right="240"/>
+      </w:pPr>
+      <w:r>
+        <w:rPr>
+          <w:rFonts w:ascii="Consolas" w:cs="Consolas" w:eastAsia="Consolas" w:hAnsi="Consolas"/>
+          <w:sz w:val="17"/>
+          <w:szCs w:val="17"/>
+        </w:rPr>
+        <w:t xml:space="preserve"> </w:t>
+      </w:r>
+    </w:p>
+    <w:p>
+      <w:pPr>
+        <w:shd w:fill="F4F6F8" w:val="clear"/>
+        <w:spacing w:after="0"/>
+        <w:ind w:left="240" w:right="240"/>
+      </w:pPr>
+      <w:r>
+        <w:rPr>
+          <w:rFonts w:ascii="Consolas" w:cs="Consolas" w:eastAsia="Consolas" w:hAnsi="Consolas"/>
+          <w:sz w:val="17"/>
+          <w:szCs w:val="17"/>
+        </w:rPr>
         <w:t xml:space="preserve">def main():</w:t>
       </w:r>
     </w:p>
@@ -7098,22 +7248,22 @@
           <w:sz w:val="17"/>
           <w:szCs w:val="17"/>
         </w:rPr>
-        <w:t xml:space="preserve">    ma = sorted(data.get("ma", []), key=lambda r: (r.get("sector",""), r.get("date","")))</w:t>
-      </w:r>
-    </w:p>
-    <w:p>
-      <w:pPr>
-        <w:shd w:fill="F4F6F8" w:val="clear"/>
-        <w:spacing w:after="0"/>
-        <w:ind w:left="240" w:right="240"/>
-      </w:pPr>
-      <w:r>
-        <w:rPr>
-          <w:rFonts w:ascii="Consolas" w:cs="Consolas" w:eastAsia="Consolas" w:hAnsi="Consolas"/>
-          <w:sz w:val="17"/>
-          <w:szCs w:val="17"/>
-        </w:rPr>
-        <w:t xml:space="preserve">    ra = sorted(data.get("raises", []), key=lambda r: (r.get("sector",""), r.get("date","")))</w:t>
+        <w:t xml:space="preserve">    ma = sorted(data.get("ma", []), key=sort_key)</w:t>
+      </w:r>
+    </w:p>
+    <w:p>
+      <w:pPr>
+        <w:shd w:fill="F4F6F8" w:val="clear"/>
+        <w:spacing w:after="0"/>
+        <w:ind w:left="240" w:right="240"/>
+      </w:pPr>
+      <w:r>
+        <w:rPr>
+          <w:rFonts w:ascii="Consolas" w:cs="Consolas" w:eastAsia="Consolas" w:hAnsi="Consolas"/>
+          <w:sz w:val="17"/>
+          <w:szCs w:val="17"/>
+        </w:rPr>
+        <w:t xml:space="preserve">    ra = sorted(data.get("raises", []), key=sort_key)</w:t>
       </w:r>
     </w:p>
     <w:p>

</xml_diff>